<commit_message>
feat: adiciona prova pratica de otimizacao da sprint 02
</commit_message>
<xml_diff>
--- a/output/docx/Grupo_INFORMAR_RotaCerta_Sprints_01_02.docx
+++ b/output/docx/Grupo_INFORMAR_RotaCerta_Sprints_01_02.docx
@@ -186,7 +186,7 @@
           <w:color w:val="000000"/>
           <w:sz w:val="22"/>
         </w:rPr>
-        <w:t>A revisão incorpora as orientações recebidas após a Sprint 01. O cronograma passa a adotar cadência semanal, com exceção do período estendido da Sprint 02 informado pela professora. A comparação entre as versões sequencial e paralela do motor de otimização também passa a ter métricas e protocolo de medição definidos.</w:t>
+        <w:t>A revisão incorpora as orientações recebidas após a Sprint 01. O cronograma passa a adotar cadência semanal, com exceção do período estendido da Sprint 02 informado pela professora. A comparação entre as versões sequencial e paralela do motor de otimização passa a ter métricas, protocolo de medição e uma primeira implementação executável com testes automatizados.</w:t>
       </w:r>
     </w:p>
     <w:p>
@@ -421,6 +421,22 @@
           <w:sz w:val="22"/>
         </w:rPr>
         <w:t>12  Avaliação sequencial e paralela</w:t>
+      </w:r>
+    </w:p>
+    <w:p>
+      <w:pPr>
+        <w:spacing w:after="60"/>
+        <w:ind w:left="198"/>
+      </w:pPr>
+      <w:r>
+        <w:rPr>
+          <w:rFonts w:ascii="Arial" w:hAnsi="Arial"/>
+          <w:b w:val="0"/>
+          <w:i w:val="0"/>
+          <w:color w:val="000000"/>
+          <w:sz w:val="22"/>
+        </w:rPr>
+        <w:t>13  Aderência às orientações da disciplina</w:t>
       </w:r>
     </w:p>
     <w:p>
@@ -5191,6 +5207,22 @@
     </w:p>
     <w:p>
       <w:pPr>
+        <w:spacing w:line="276" w:lineRule="auto" w:after="120"/>
+        <w:jc w:val="both"/>
+      </w:pPr>
+      <w:r>
+        <w:rPr>
+          <w:rFonts w:ascii="Arial" w:hAnsi="Arial"/>
+          <w:b w:val="0"/>
+          <w:i w:val="0"/>
+          <w:color w:val="000000"/>
+          <w:sz w:val="22"/>
+        </w:rPr>
+        <w:t>A escolha de Python não pressupõe o uso de inteligência artificial. As orientações da disciplina aceitam inteligência artificial e/ou otimização de processamento, paralelização e alto desempenho. No RotaCerta, o componente avançado é a otimização de rotas integrada ao fluxo principal. React e TypeScript permanecem restritos à interface, enquanto Python executa o núcleo computacional.</w:t>
+      </w:r>
+    </w:p>
+    <w:p>
+      <w:pPr>
         <w:pStyle w:val="Heading2"/>
         <w:keepNext/>
         <w:spacing w:before="160" w:after="100"/>
@@ -7471,6 +7503,122 @@
                 <w:color w:val="000000"/>
                 <w:sz w:val="18"/>
               </w:rPr>
+              <w:t>backend/app/optimizer/</w:t>
+            </w:r>
+          </w:p>
+        </w:tc>
+        <w:tc>
+          <w:tcPr>
+            <w:tcW w:type="dxa" w:w="6350"/>
+            <w:vAlign w:val="center"/>
+            <w:tcMar>
+              <w:top w:w="90" w:type="dxa"/>
+              <w:start w:w="110" w:type="dxa"/>
+              <w:bottom w:w="90" w:type="dxa"/>
+              <w:end w:w="110" w:type="dxa"/>
+            </w:tcMar>
+            <w:shd w:fill="F5F7FA"/>
+          </w:tcPr>
+          <w:p>
+            <w:pPr>
+              <w:spacing w:after="0" w:line="252" w:lineRule="auto"/>
+            </w:pPr>
+            <w:r>
+              <w:rPr>
+                <w:rFonts w:ascii="Arial" w:hAnsi="Arial"/>
+                <w:b w:val="0"/>
+                <w:i w:val="0"/>
+                <w:color w:val="000000"/>
+                <w:sz w:val="18"/>
+              </w:rPr>
+              <w:t>Vizinho mais próximo, 2-opt e execução sequencial ou paralela</w:t>
+            </w:r>
+          </w:p>
+        </w:tc>
+      </w:tr>
+      <w:tr>
+        <w:tc>
+          <w:tcPr>
+            <w:tcW w:type="dxa" w:w="3402"/>
+            <w:vAlign w:val="center"/>
+            <w:tcMar>
+              <w:top w:w="90" w:type="dxa"/>
+              <w:start w:w="110" w:type="dxa"/>
+              <w:bottom w:w="90" w:type="dxa"/>
+              <w:end w:w="110" w:type="dxa"/>
+            </w:tcMar>
+          </w:tcPr>
+          <w:p>
+            <w:pPr>
+              <w:spacing w:after="0" w:line="252" w:lineRule="auto"/>
+              <w:jc w:val="center"/>
+            </w:pPr>
+            <w:r>
+              <w:rPr>
+                <w:rFonts w:ascii="Arial" w:hAnsi="Arial"/>
+                <w:b w:val="0"/>
+                <w:i w:val="0"/>
+                <w:color w:val="000000"/>
+                <w:sz w:val="18"/>
+              </w:rPr>
+              <w:t>backend/tests/</w:t>
+            </w:r>
+          </w:p>
+        </w:tc>
+        <w:tc>
+          <w:tcPr>
+            <w:tcW w:type="dxa" w:w="6350"/>
+            <w:vAlign w:val="center"/>
+            <w:tcMar>
+              <w:top w:w="90" w:type="dxa"/>
+              <w:start w:w="110" w:type="dxa"/>
+              <w:bottom w:w="90" w:type="dxa"/>
+              <w:end w:w="110" w:type="dxa"/>
+            </w:tcMar>
+          </w:tcPr>
+          <w:p>
+            <w:pPr>
+              <w:spacing w:after="0" w:line="252" w:lineRule="auto"/>
+            </w:pPr>
+            <w:r>
+              <w:rPr>
+                <w:rFonts w:ascii="Arial" w:hAnsi="Arial"/>
+                <w:b w:val="0"/>
+                <w:i w:val="0"/>
+                <w:color w:val="000000"/>
+                <w:sz w:val="18"/>
+              </w:rPr>
+              <w:t>Testes automatizados do núcleo de roteirização</w:t>
+            </w:r>
+          </w:p>
+        </w:tc>
+      </w:tr>
+      <w:tr>
+        <w:tc>
+          <w:tcPr>
+            <w:tcW w:type="dxa" w:w="3402"/>
+            <w:vAlign w:val="center"/>
+            <w:tcMar>
+              <w:top w:w="90" w:type="dxa"/>
+              <w:start w:w="110" w:type="dxa"/>
+              <w:bottom w:w="90" w:type="dxa"/>
+              <w:end w:w="110" w:type="dxa"/>
+            </w:tcMar>
+            <w:shd w:fill="F5F7FA"/>
+          </w:tcPr>
+          <w:p>
+            <w:pPr>
+              <w:spacing w:after="0" w:line="252" w:lineRule="auto"/>
+              <w:jc w:val="center"/>
+            </w:pPr>
+            <w:r>
+              <w:rPr>
+                <w:rFonts w:ascii="Arial" w:hAnsi="Arial"/>
+                <w:b w:val="0"/>
+                <w:i w:val="0"/>
+                <w:color w:val="000000"/>
+                <w:sz w:val="18"/>
+              </w:rPr>
               <w:t>frontend/</w:t>
             </w:r>
           </w:p>
@@ -8244,7 +8392,7 @@
           <w:color w:val="000000"/>
           <w:sz w:val="22"/>
         </w:rPr>
-        <w:t>A orientação da Sprint 01 exige manter a comparação entre as versões sequencial e paralela. As duas versões usarão os mesmos pedidos, entregadores, matriz de distâncias, heurística de vizinho mais próximo e refinamento 2-opt. A única variável controlada será o modo de execução.</w:t>
+        <w:t>A orientação da Sprint 01 exige manter a comparação entre as versões sequencial e paralela. A primeira implementação já executa vizinho mais próximo e refinamento 2-opt nos dois modos. As versões usam os mesmos pedidos, entregadores e coordenadas; a única variável controlada é o modo de execução.</w:t>
       </w:r>
     </w:p>
     <w:tbl>
@@ -8805,8 +8953,772 @@
       </w:r>
     </w:p>
     <w:p>
+      <w:pPr>
+        <w:pStyle w:val="Heading3"/>
+        <w:keepNext/>
+        <w:spacing w:before="160" w:after="100"/>
+      </w:pPr>
+      <w:r>
+        <w:t>Evidência prática</w:t>
+      </w:r>
+    </w:p>
+    <w:p>
+      <w:pPr>
+        <w:spacing w:line="276" w:lineRule="auto" w:after="120"/>
+        <w:jc w:val="both"/>
+      </w:pPr>
+      <w:r>
+        <w:rPr>
+          <w:rFonts w:ascii="Arial" w:hAnsi="Arial"/>
+          <w:b w:val="0"/>
+          <w:i w:val="0"/>
+          <w:color w:val="000000"/>
+          <w:sz w:val="22"/>
+        </w:rPr>
+        <w:t>O arquivo backend/app/optimizer/routing.py contém a heurística determinística, o cálculo de distância geodésica, o refinamento 2-opt e a execução com processos independentes. O endpoint POST /optimizer/compare retorna rotas, distâncias, tempos, workers, speedup e a confirmação de equivalência entre os modos. Cinco testes automatizados validam rota vazia, preservação das paradas, melhoria do 2-opt, resultado da otimização e equivalência sequencial/paralela.</w:t>
+      </w:r>
+    </w:p>
+    <w:p>
       <w:r>
         <w:br w:type="page"/>
+      </w:r>
+    </w:p>
+    <w:p>
+      <w:pPr>
+        <w:pStyle w:val="Heading2"/>
+        <w:keepNext/>
+        <w:spacing w:before="160" w:after="100"/>
+      </w:pPr>
+      <w:r>
+        <w:t>13  Aderência às orientações da disciplina</w:t>
+      </w:r>
+    </w:p>
+    <w:tbl>
+      <w:tblPr>
+        <w:tblW w:type="auto" w:w="0"/>
+        <w:jc w:val="center"/>
+        <w:tblLayout w:type="fixed"/>
+        <w:tblLook w:firstColumn="1" w:firstRow="1" w:lastColumn="0" w:lastRow="0" w:noHBand="0" w:noVBand="1" w:val="04A0"/>
+        <w:tblBorders>
+          <w:top w:val="single" w:sz="6" w:color="D9D9D9"/>
+          <w:left w:val="single" w:sz="6" w:color="D9D9D9"/>
+          <w:bottom w:val="single" w:sz="6" w:color="D9D9D9"/>
+          <w:right w:val="single" w:sz="6" w:color="D9D9D9"/>
+          <w:insideH w:val="single" w:sz="6" w:color="D9D9D9"/>
+          <w:insideV w:val="single" w:sz="6" w:color="D9D9D9"/>
+        </w:tblBorders>
+      </w:tblPr>
+      <w:tblGrid>
+        <w:gridCol w:w="3289"/>
+        <w:gridCol w:w="3289"/>
+        <w:gridCol w:w="3289"/>
+      </w:tblGrid>
+      <w:tr>
+        <w:trPr>
+          <w:tblHeader w:val="true"/>
+        </w:trPr>
+        <w:tc>
+          <w:tcPr>
+            <w:tcW w:type="dxa" w:w="2324"/>
+            <w:shd w:fill="173B67"/>
+            <w:vAlign w:val="center"/>
+            <w:tcMar>
+              <w:top w:w="90" w:type="dxa"/>
+              <w:start w:w="110" w:type="dxa"/>
+              <w:bottom w:w="90" w:type="dxa"/>
+              <w:end w:w="110" w:type="dxa"/>
+            </w:tcMar>
+          </w:tcPr>
+          <w:p>
+            <w:pPr>
+              <w:jc w:val="center"/>
+            </w:pPr>
+            <w:r>
+              <w:rPr>
+                <w:rFonts w:ascii="Arial" w:hAnsi="Arial"/>
+                <w:b/>
+                <w:i w:val="0"/>
+                <w:color w:val="FFFFFF"/>
+                <w:sz w:val="17"/>
+              </w:rPr>
+              <w:t>Orientação</w:t>
+            </w:r>
+          </w:p>
+        </w:tc>
+        <w:tc>
+          <w:tcPr>
+            <w:tcW w:type="dxa" w:w="1587"/>
+            <w:shd w:fill="173B67"/>
+            <w:vAlign w:val="center"/>
+            <w:tcMar>
+              <w:top w:w="90" w:type="dxa"/>
+              <w:start w:w="110" w:type="dxa"/>
+              <w:bottom w:w="90" w:type="dxa"/>
+              <w:end w:w="110" w:type="dxa"/>
+            </w:tcMar>
+          </w:tcPr>
+          <w:p>
+            <w:pPr>
+              <w:jc w:val="center"/>
+            </w:pPr>
+            <w:r>
+              <w:rPr>
+                <w:rFonts w:ascii="Arial" w:hAnsi="Arial"/>
+                <w:b/>
+                <w:i w:val="0"/>
+                <w:color w:val="FFFFFF"/>
+                <w:sz w:val="17"/>
+              </w:rPr>
+              <w:t>Situação</w:t>
+            </w:r>
+          </w:p>
+        </w:tc>
+        <w:tc>
+          <w:tcPr>
+            <w:tcW w:type="dxa" w:w="5839"/>
+            <w:shd w:fill="173B67"/>
+            <w:vAlign w:val="center"/>
+            <w:tcMar>
+              <w:top w:w="90" w:type="dxa"/>
+              <w:start w:w="110" w:type="dxa"/>
+              <w:bottom w:w="90" w:type="dxa"/>
+              <w:end w:w="110" w:type="dxa"/>
+            </w:tcMar>
+          </w:tcPr>
+          <w:p>
+            <w:pPr>
+              <w:jc w:val="center"/>
+            </w:pPr>
+            <w:r>
+              <w:rPr>
+                <w:rFonts w:ascii="Arial" w:hAnsi="Arial"/>
+                <w:b/>
+                <w:i w:val="0"/>
+                <w:color w:val="FFFFFF"/>
+                <w:sz w:val="17"/>
+              </w:rPr>
+              <w:t>Evidência</w:t>
+            </w:r>
+          </w:p>
+        </w:tc>
+      </w:tr>
+      <w:tr>
+        <w:tc>
+          <w:tcPr>
+            <w:tcW w:type="dxa" w:w="2324"/>
+            <w:vAlign w:val="center"/>
+            <w:tcMar>
+              <w:top w:w="90" w:type="dxa"/>
+              <w:start w:w="110" w:type="dxa"/>
+              <w:bottom w:w="90" w:type="dxa"/>
+              <w:end w:w="110" w:type="dxa"/>
+            </w:tcMar>
+          </w:tcPr>
+          <w:p>
+            <w:pPr>
+              <w:spacing w:after="0" w:line="252" w:lineRule="auto"/>
+              <w:jc w:val="center"/>
+            </w:pPr>
+            <w:r>
+              <w:rPr>
+                <w:rFonts w:ascii="Arial" w:hAnsi="Arial"/>
+                <w:b w:val="0"/>
+                <w:i w:val="0"/>
+                <w:color w:val="000000"/>
+                <w:sz w:val="17"/>
+              </w:rPr>
+              <w:t>Projeto integrado</w:t>
+            </w:r>
+          </w:p>
+        </w:tc>
+        <w:tc>
+          <w:tcPr>
+            <w:tcW w:type="dxa" w:w="1587"/>
+            <w:vAlign w:val="center"/>
+            <w:tcMar>
+              <w:top w:w="90" w:type="dxa"/>
+              <w:start w:w="110" w:type="dxa"/>
+              <w:bottom w:w="90" w:type="dxa"/>
+              <w:end w:w="110" w:type="dxa"/>
+            </w:tcMar>
+          </w:tcPr>
+          <w:p>
+            <w:pPr>
+              <w:spacing w:after="0" w:line="252" w:lineRule="auto"/>
+            </w:pPr>
+            <w:r>
+              <w:rPr>
+                <w:rFonts w:ascii="Arial" w:hAnsi="Arial"/>
+                <w:b w:val="0"/>
+                <w:i w:val="0"/>
+                <w:color w:val="000000"/>
+                <w:sz w:val="17"/>
+              </w:rPr>
+              <w:t>Atendido</w:t>
+            </w:r>
+          </w:p>
+        </w:tc>
+        <w:tc>
+          <w:tcPr>
+            <w:tcW w:type="dxa" w:w="5839"/>
+            <w:vAlign w:val="center"/>
+            <w:tcMar>
+              <w:top w:w="90" w:type="dxa"/>
+              <w:start w:w="110" w:type="dxa"/>
+              <w:bottom w:w="90" w:type="dxa"/>
+              <w:end w:w="110" w:type="dxa"/>
+            </w:tcMar>
+          </w:tcPr>
+          <w:p>
+            <w:pPr>
+              <w:spacing w:after="0" w:line="252" w:lineRule="auto"/>
+            </w:pPr>
+            <w:r>
+              <w:rPr>
+                <w:rFonts w:ascii="Arial" w:hAnsi="Arial"/>
+                <w:b w:val="0"/>
+                <w:i w:val="0"/>
+                <w:color w:val="000000"/>
+                <w:sz w:val="17"/>
+              </w:rPr>
+              <w:t>Um único sistema reúne interface, API, banco e otimização</w:t>
+            </w:r>
+          </w:p>
+        </w:tc>
+      </w:tr>
+      <w:tr>
+        <w:tc>
+          <w:tcPr>
+            <w:tcW w:type="dxa" w:w="2324"/>
+            <w:vAlign w:val="center"/>
+            <w:tcMar>
+              <w:top w:w="90" w:type="dxa"/>
+              <w:start w:w="110" w:type="dxa"/>
+              <w:bottom w:w="90" w:type="dxa"/>
+              <w:end w:w="110" w:type="dxa"/>
+            </w:tcMar>
+            <w:shd w:fill="F5F7FA"/>
+          </w:tcPr>
+          <w:p>
+            <w:pPr>
+              <w:spacing w:after="0" w:line="252" w:lineRule="auto"/>
+              <w:jc w:val="center"/>
+            </w:pPr>
+            <w:r>
+              <w:rPr>
+                <w:rFonts w:ascii="Arial" w:hAnsi="Arial"/>
+                <w:b w:val="0"/>
+                <w:i w:val="0"/>
+                <w:color w:val="000000"/>
+                <w:sz w:val="17"/>
+              </w:rPr>
+              <w:t>Componente avançado</w:t>
+            </w:r>
+          </w:p>
+        </w:tc>
+        <w:tc>
+          <w:tcPr>
+            <w:tcW w:type="dxa" w:w="1587"/>
+            <w:vAlign w:val="center"/>
+            <w:tcMar>
+              <w:top w:w="90" w:type="dxa"/>
+              <w:start w:w="110" w:type="dxa"/>
+              <w:bottom w:w="90" w:type="dxa"/>
+              <w:end w:w="110" w:type="dxa"/>
+            </w:tcMar>
+            <w:shd w:fill="F5F7FA"/>
+          </w:tcPr>
+          <w:p>
+            <w:pPr>
+              <w:spacing w:after="0" w:line="252" w:lineRule="auto"/>
+            </w:pPr>
+            <w:r>
+              <w:rPr>
+                <w:rFonts w:ascii="Arial" w:hAnsi="Arial"/>
+                <w:b w:val="0"/>
+                <w:i w:val="0"/>
+                <w:color w:val="000000"/>
+                <w:sz w:val="17"/>
+              </w:rPr>
+              <w:t>Atendido</w:t>
+            </w:r>
+          </w:p>
+        </w:tc>
+        <w:tc>
+          <w:tcPr>
+            <w:tcW w:type="dxa" w:w="5839"/>
+            <w:vAlign w:val="center"/>
+            <w:tcMar>
+              <w:top w:w="90" w:type="dxa"/>
+              <w:start w:w="110" w:type="dxa"/>
+              <w:bottom w:w="90" w:type="dxa"/>
+              <w:end w:w="110" w:type="dxa"/>
+            </w:tcMar>
+            <w:shd w:fill="F5F7FA"/>
+          </w:tcPr>
+          <w:p>
+            <w:pPr>
+              <w:spacing w:after="0" w:line="252" w:lineRule="auto"/>
+            </w:pPr>
+            <w:r>
+              <w:rPr>
+                <w:rFonts w:ascii="Arial" w:hAnsi="Arial"/>
+                <w:b w:val="0"/>
+                <w:i w:val="0"/>
+                <w:color w:val="000000"/>
+                <w:sz w:val="17"/>
+              </w:rPr>
+              <w:t>Otimização e paralelização fazem parte da geração de rotas</w:t>
+            </w:r>
+          </w:p>
+        </w:tc>
+      </w:tr>
+      <w:tr>
+        <w:tc>
+          <w:tcPr>
+            <w:tcW w:type="dxa" w:w="2324"/>
+            <w:vAlign w:val="center"/>
+            <w:tcMar>
+              <w:top w:w="90" w:type="dxa"/>
+              <w:start w:w="110" w:type="dxa"/>
+              <w:bottom w:w="90" w:type="dxa"/>
+              <w:end w:w="110" w:type="dxa"/>
+            </w:tcMar>
+          </w:tcPr>
+          <w:p>
+            <w:pPr>
+              <w:spacing w:after="0" w:line="252" w:lineRule="auto"/>
+              <w:jc w:val="center"/>
+            </w:pPr>
+            <w:r>
+              <w:rPr>
+                <w:rFonts w:ascii="Arial" w:hAnsi="Arial"/>
+                <w:b w:val="0"/>
+                <w:i w:val="0"/>
+                <w:color w:val="000000"/>
+                <w:sz w:val="17"/>
+              </w:rPr>
+              <w:t>Tecnologia prioritária</w:t>
+            </w:r>
+          </w:p>
+        </w:tc>
+        <w:tc>
+          <w:tcPr>
+            <w:tcW w:type="dxa" w:w="1587"/>
+            <w:vAlign w:val="center"/>
+            <w:tcMar>
+              <w:top w:w="90" w:type="dxa"/>
+              <w:start w:w="110" w:type="dxa"/>
+              <w:bottom w:w="90" w:type="dxa"/>
+              <w:end w:w="110" w:type="dxa"/>
+            </w:tcMar>
+          </w:tcPr>
+          <w:p>
+            <w:pPr>
+              <w:spacing w:after="0" w:line="252" w:lineRule="auto"/>
+            </w:pPr>
+            <w:r>
+              <w:rPr>
+                <w:rFonts w:ascii="Arial" w:hAnsi="Arial"/>
+                <w:b w:val="0"/>
+                <w:i w:val="0"/>
+                <w:color w:val="000000"/>
+                <w:sz w:val="17"/>
+              </w:rPr>
+              <w:t>Atendido</w:t>
+            </w:r>
+          </w:p>
+        </w:tc>
+        <w:tc>
+          <w:tcPr>
+            <w:tcW w:type="dxa" w:w="5839"/>
+            <w:vAlign w:val="center"/>
+            <w:tcMar>
+              <w:top w:w="90" w:type="dxa"/>
+              <w:start w:w="110" w:type="dxa"/>
+              <w:bottom w:w="90" w:type="dxa"/>
+              <w:end w:w="110" w:type="dxa"/>
+            </w:tcMar>
+          </w:tcPr>
+          <w:p>
+            <w:pPr>
+              <w:spacing w:after="0" w:line="252" w:lineRule="auto"/>
+            </w:pPr>
+            <w:r>
+              <w:rPr>
+                <w:rFonts w:ascii="Arial" w:hAnsi="Arial"/>
+                <w:b w:val="0"/>
+                <w:i w:val="0"/>
+                <w:color w:val="000000"/>
+                <w:sz w:val="17"/>
+              </w:rPr>
+              <w:t>Python no núcleo; JavaScript e TypeScript apenas na interface</w:t>
+            </w:r>
+          </w:p>
+        </w:tc>
+      </w:tr>
+      <w:tr>
+        <w:tc>
+          <w:tcPr>
+            <w:tcW w:type="dxa" w:w="2324"/>
+            <w:vAlign w:val="center"/>
+            <w:tcMar>
+              <w:top w:w="90" w:type="dxa"/>
+              <w:start w:w="110" w:type="dxa"/>
+              <w:bottom w:w="90" w:type="dxa"/>
+              <w:end w:w="110" w:type="dxa"/>
+            </w:tcMar>
+            <w:shd w:fill="F5F7FA"/>
+          </w:tcPr>
+          <w:p>
+            <w:pPr>
+              <w:spacing w:after="0" w:line="252" w:lineRule="auto"/>
+              <w:jc w:val="center"/>
+            </w:pPr>
+            <w:r>
+              <w:rPr>
+                <w:rFonts w:ascii="Arial" w:hAnsi="Arial"/>
+                <w:b w:val="0"/>
+                <w:i w:val="0"/>
+                <w:color w:val="000000"/>
+                <w:sz w:val="17"/>
+              </w:rPr>
+              <w:t>Integração não superficial</w:t>
+            </w:r>
+          </w:p>
+        </w:tc>
+        <w:tc>
+          <w:tcPr>
+            <w:tcW w:type="dxa" w:w="1587"/>
+            <w:vAlign w:val="center"/>
+            <w:tcMar>
+              <w:top w:w="90" w:type="dxa"/>
+              <w:start w:w="110" w:type="dxa"/>
+              <w:bottom w:w="90" w:type="dxa"/>
+              <w:end w:w="110" w:type="dxa"/>
+            </w:tcMar>
+            <w:shd w:fill="F5F7FA"/>
+          </w:tcPr>
+          <w:p>
+            <w:pPr>
+              <w:spacing w:after="0" w:line="252" w:lineRule="auto"/>
+            </w:pPr>
+            <w:r>
+              <w:rPr>
+                <w:rFonts w:ascii="Arial" w:hAnsi="Arial"/>
+                <w:b w:val="0"/>
+                <w:i w:val="0"/>
+                <w:color w:val="000000"/>
+                <w:sz w:val="17"/>
+              </w:rPr>
+              <w:t>Atendido</w:t>
+            </w:r>
+          </w:p>
+        </w:tc>
+        <w:tc>
+          <w:tcPr>
+            <w:tcW w:type="dxa" w:w="5839"/>
+            <w:vAlign w:val="center"/>
+            <w:tcMar>
+              <w:top w:w="90" w:type="dxa"/>
+              <w:start w:w="110" w:type="dxa"/>
+              <w:bottom w:w="90" w:type="dxa"/>
+              <w:end w:w="110" w:type="dxa"/>
+            </w:tcMar>
+            <w:shd w:fill="F5F7FA"/>
+          </w:tcPr>
+          <w:p>
+            <w:pPr>
+              <w:spacing w:after="0" w:line="252" w:lineRule="auto"/>
+            </w:pPr>
+            <w:r>
+              <w:rPr>
+                <w:rFonts w:ascii="Arial" w:hAnsi="Arial"/>
+                <w:b w:val="0"/>
+                <w:i w:val="0"/>
+                <w:color w:val="000000"/>
+                <w:sz w:val="17"/>
+              </w:rPr>
+              <w:t>O endpoint compara os modos sobre os mesmos dados</w:t>
+            </w:r>
+          </w:p>
+        </w:tc>
+      </w:tr>
+      <w:tr>
+        <w:tc>
+          <w:tcPr>
+            <w:tcW w:type="dxa" w:w="2324"/>
+            <w:vAlign w:val="center"/>
+            <w:tcMar>
+              <w:top w:w="90" w:type="dxa"/>
+              <w:start w:w="110" w:type="dxa"/>
+              <w:bottom w:w="90" w:type="dxa"/>
+              <w:end w:w="110" w:type="dxa"/>
+            </w:tcMar>
+          </w:tcPr>
+          <w:p>
+            <w:pPr>
+              <w:spacing w:after="0" w:line="252" w:lineRule="auto"/>
+              <w:jc w:val="center"/>
+            </w:pPr>
+            <w:r>
+              <w:rPr>
+                <w:rFonts w:ascii="Arial" w:hAnsi="Arial"/>
+                <w:b w:val="0"/>
+                <w:i w:val="0"/>
+                <w:color w:val="000000"/>
+                <w:sz w:val="17"/>
+              </w:rPr>
+              <w:t>Evolução prática</w:t>
+            </w:r>
+          </w:p>
+        </w:tc>
+        <w:tc>
+          <w:tcPr>
+            <w:tcW w:type="dxa" w:w="1587"/>
+            <w:vAlign w:val="center"/>
+            <w:tcMar>
+              <w:top w:w="90" w:type="dxa"/>
+              <w:start w:w="110" w:type="dxa"/>
+              <w:bottom w:w="90" w:type="dxa"/>
+              <w:end w:w="110" w:type="dxa"/>
+            </w:tcMar>
+          </w:tcPr>
+          <w:p>
+            <w:pPr>
+              <w:spacing w:after="0" w:line="252" w:lineRule="auto"/>
+            </w:pPr>
+            <w:r>
+              <w:rPr>
+                <w:rFonts w:ascii="Arial" w:hAnsi="Arial"/>
+                <w:b w:val="0"/>
+                <w:i w:val="0"/>
+                <w:color w:val="000000"/>
+                <w:sz w:val="17"/>
+              </w:rPr>
+              <w:t>Atendido</w:t>
+            </w:r>
+          </w:p>
+        </w:tc>
+        <w:tc>
+          <w:tcPr>
+            <w:tcW w:type="dxa" w:w="5839"/>
+            <w:vAlign w:val="center"/>
+            <w:tcMar>
+              <w:top w:w="90" w:type="dxa"/>
+              <w:start w:w="110" w:type="dxa"/>
+              <w:bottom w:w="90" w:type="dxa"/>
+              <w:end w:w="110" w:type="dxa"/>
+            </w:tcMar>
+          </w:tcPr>
+          <w:p>
+            <w:pPr>
+              <w:spacing w:after="0" w:line="252" w:lineRule="auto"/>
+            </w:pPr>
+            <w:r>
+              <w:rPr>
+                <w:rFonts w:ascii="Arial" w:hAnsi="Arial"/>
+                <w:b w:val="0"/>
+                <w:i w:val="0"/>
+                <w:color w:val="000000"/>
+                <w:sz w:val="17"/>
+              </w:rPr>
+              <w:t>Código executável e cinco testes automatizados no repositório</w:t>
+            </w:r>
+          </w:p>
+        </w:tc>
+      </w:tr>
+      <w:tr>
+        <w:tc>
+          <w:tcPr>
+            <w:tcW w:type="dxa" w:w="2324"/>
+            <w:vAlign w:val="center"/>
+            <w:tcMar>
+              <w:top w:w="90" w:type="dxa"/>
+              <w:start w:w="110" w:type="dxa"/>
+              <w:bottom w:w="90" w:type="dxa"/>
+              <w:end w:w="110" w:type="dxa"/>
+            </w:tcMar>
+            <w:shd w:fill="F5F7FA"/>
+          </w:tcPr>
+          <w:p>
+            <w:pPr>
+              <w:spacing w:after="0" w:line="252" w:lineRule="auto"/>
+              <w:jc w:val="center"/>
+            </w:pPr>
+            <w:r>
+              <w:rPr>
+                <w:rFonts w:ascii="Arial" w:hAnsi="Arial"/>
+                <w:b w:val="0"/>
+                <w:i w:val="0"/>
+                <w:color w:val="000000"/>
+                <w:sz w:val="17"/>
+              </w:rPr>
+              <w:t>GitHub atualizado</w:t>
+            </w:r>
+          </w:p>
+        </w:tc>
+        <w:tc>
+          <w:tcPr>
+            <w:tcW w:type="dxa" w:w="1587"/>
+            <w:vAlign w:val="center"/>
+            <w:tcMar>
+              <w:top w:w="90" w:type="dxa"/>
+              <w:start w:w="110" w:type="dxa"/>
+              <w:bottom w:w="90" w:type="dxa"/>
+              <w:end w:w="110" w:type="dxa"/>
+            </w:tcMar>
+            <w:shd w:fill="F5F7FA"/>
+          </w:tcPr>
+          <w:p>
+            <w:pPr>
+              <w:spacing w:after="0" w:line="252" w:lineRule="auto"/>
+            </w:pPr>
+            <w:r>
+              <w:rPr>
+                <w:rFonts w:ascii="Arial" w:hAnsi="Arial"/>
+                <w:b w:val="0"/>
+                <w:i w:val="0"/>
+                <w:color w:val="000000"/>
+                <w:sz w:val="17"/>
+              </w:rPr>
+              <w:t>Atendido</w:t>
+            </w:r>
+          </w:p>
+        </w:tc>
+        <w:tc>
+          <w:tcPr>
+            <w:tcW w:type="dxa" w:w="5839"/>
+            <w:vAlign w:val="center"/>
+            <w:tcMar>
+              <w:top w:w="90" w:type="dxa"/>
+              <w:start w:w="110" w:type="dxa"/>
+              <w:bottom w:w="90" w:type="dxa"/>
+              <w:end w:w="110" w:type="dxa"/>
+            </w:tcMar>
+            <w:shd w:fill="F5F7FA"/>
+          </w:tcPr>
+          <w:p>
+            <w:pPr>
+              <w:spacing w:after="0" w:line="252" w:lineRule="auto"/>
+            </w:pPr>
+            <w:r>
+              <w:rPr>
+                <w:rFonts w:ascii="Arial" w:hAnsi="Arial"/>
+                <w:b w:val="0"/>
+                <w:i w:val="0"/>
+                <w:color w:val="000000"/>
+                <w:sz w:val="17"/>
+              </w:rPr>
+              <w:t>Branch da Sprint 02 e Pull Request número 1</w:t>
+            </w:r>
+          </w:p>
+        </w:tc>
+      </w:tr>
+      <w:tr>
+        <w:tc>
+          <w:tcPr>
+            <w:tcW w:type="dxa" w:w="2324"/>
+            <w:vAlign w:val="center"/>
+            <w:tcMar>
+              <w:top w:w="90" w:type="dxa"/>
+              <w:start w:w="110" w:type="dxa"/>
+              <w:bottom w:w="90" w:type="dxa"/>
+              <w:end w:w="110" w:type="dxa"/>
+            </w:tcMar>
+          </w:tcPr>
+          <w:p>
+            <w:pPr>
+              <w:spacing w:after="0" w:line="252" w:lineRule="auto"/>
+              <w:jc w:val="center"/>
+            </w:pPr>
+            <w:r>
+              <w:rPr>
+                <w:rFonts w:ascii="Arial" w:hAnsi="Arial"/>
+                <w:b w:val="0"/>
+                <w:i w:val="0"/>
+                <w:color w:val="000000"/>
+                <w:sz w:val="17"/>
+              </w:rPr>
+              <w:t>Participação da equipe</w:t>
+            </w:r>
+          </w:p>
+        </w:tc>
+        <w:tc>
+          <w:tcPr>
+            <w:tcW w:type="dxa" w:w="1587"/>
+            <w:vAlign w:val="center"/>
+            <w:tcMar>
+              <w:top w:w="90" w:type="dxa"/>
+              <w:start w:w="110" w:type="dxa"/>
+              <w:bottom w:w="90" w:type="dxa"/>
+              <w:end w:w="110" w:type="dxa"/>
+            </w:tcMar>
+          </w:tcPr>
+          <w:p>
+            <w:pPr>
+              <w:spacing w:after="0" w:line="252" w:lineRule="auto"/>
+            </w:pPr>
+            <w:r>
+              <w:rPr>
+                <w:rFonts w:ascii="Arial" w:hAnsi="Arial"/>
+                <w:b w:val="0"/>
+                <w:i w:val="0"/>
+                <w:color w:val="000000"/>
+                <w:sz w:val="17"/>
+              </w:rPr>
+              <w:t>Contínuo</w:t>
+            </w:r>
+          </w:p>
+        </w:tc>
+        <w:tc>
+          <w:tcPr>
+            <w:tcW w:type="dxa" w:w="5839"/>
+            <w:vAlign w:val="center"/>
+            <w:tcMar>
+              <w:top w:w="90" w:type="dxa"/>
+              <w:start w:w="110" w:type="dxa"/>
+              <w:bottom w:w="90" w:type="dxa"/>
+              <w:end w:w="110" w:type="dxa"/>
+            </w:tcMar>
+          </w:tcPr>
+          <w:p>
+            <w:pPr>
+              <w:spacing w:after="0" w:line="252" w:lineRule="auto"/>
+            </w:pPr>
+            <w:r>
+              <w:rPr>
+                <w:rFonts w:ascii="Arial" w:hAnsi="Arial"/>
+                <w:b w:val="0"/>
+                <w:i w:val="0"/>
+                <w:color w:val="000000"/>
+                <w:sz w:val="17"/>
+              </w:rPr>
+              <w:t>Cada integrante deve registrar contribuições próprias nas próximas tarefas</w:t>
+            </w:r>
+          </w:p>
+        </w:tc>
+      </w:tr>
+    </w:tbl>
+    <w:p>
+      <w:pPr>
+        <w:spacing w:after="40"/>
+      </w:pPr>
+    </w:p>
+    <w:p>
+      <w:pPr>
+        <w:spacing w:line="276" w:lineRule="auto" w:after="120"/>
+        <w:jc w:val="both"/>
+      </w:pPr>
+      <w:r>
+        <w:rPr>
+          <w:rFonts w:ascii="Arial" w:hAnsi="Arial"/>
+          <w:b w:val="0"/>
+          <w:i w:val="0"/>
+          <w:color w:val="000000"/>
+          <w:sz w:val="22"/>
+        </w:rPr>
+        <w:t>Os requisitos de software completo, autenticação, perfis, funcionalidades integradas e demonstração final pertencem à evolução do semestre. A Sprint 02 estabelece a base verificável para essas implementações sem declarar como concluído o produto final.</w:t>
       </w:r>
     </w:p>
     <w:p>
@@ -9466,7 +10378,7 @@
                 <w:color w:val="000000"/>
                 <w:sz w:val="17"/>
               </w:rPr>
-              <w:t>GitHub</w:t>
+              <w:t>Motor de otimização</w:t>
             </w:r>
           </w:p>
         </w:tc>
@@ -9520,7 +10432,7 @@
                 <w:color w:val="000000"/>
                 <w:sz w:val="17"/>
               </w:rPr>
-              <w:t>Estrutura, padrões de contribuição e branch de Sprint</w:t>
+              <w:t>Primeira versão sequencial/paralela com cinco testes</w:t>
             </w:r>
           </w:p>
         </w:tc>
@@ -9551,7 +10463,7 @@
                 <w:color w:val="000000"/>
                 <w:sz w:val="17"/>
               </w:rPr>
-              <w:t>Número do grupo</w:t>
+              <w:t>GitHub</w:t>
             </w:r>
           </w:p>
         </w:tc>
@@ -9579,6 +10491,91 @@
                 <w:color w:val="000000"/>
                 <w:sz w:val="17"/>
               </w:rPr>
+              <w:t>Concluído</w:t>
+            </w:r>
+          </w:p>
+        </w:tc>
+        <w:tc>
+          <w:tcPr>
+            <w:tcW w:type="dxa" w:w="5896"/>
+            <w:vAlign w:val="center"/>
+            <w:tcMar>
+              <w:top w:w="90" w:type="dxa"/>
+              <w:start w:w="110" w:type="dxa"/>
+              <w:bottom w:w="90" w:type="dxa"/>
+              <w:end w:w="110" w:type="dxa"/>
+            </w:tcMar>
+            <w:shd w:fill="F5F7FA"/>
+          </w:tcPr>
+          <w:p>
+            <w:pPr>
+              <w:spacing w:after="0" w:line="252" w:lineRule="auto"/>
+            </w:pPr>
+            <w:r>
+              <w:rPr>
+                <w:rFonts w:ascii="Arial" w:hAnsi="Arial"/>
+                <w:b w:val="0"/>
+                <w:i w:val="0"/>
+                <w:color w:val="000000"/>
+                <w:sz w:val="17"/>
+              </w:rPr>
+              <w:t>Estrutura, padrões, branch da Sprint e Pull Request número 1</w:t>
+            </w:r>
+          </w:p>
+        </w:tc>
+      </w:tr>
+      <w:tr>
+        <w:tc>
+          <w:tcPr>
+            <w:tcW w:type="dxa" w:w="2268"/>
+            <w:vAlign w:val="center"/>
+            <w:tcMar>
+              <w:top w:w="90" w:type="dxa"/>
+              <w:start w:w="110" w:type="dxa"/>
+              <w:bottom w:w="90" w:type="dxa"/>
+              <w:end w:w="110" w:type="dxa"/>
+            </w:tcMar>
+          </w:tcPr>
+          <w:p>
+            <w:pPr>
+              <w:spacing w:after="0" w:line="252" w:lineRule="auto"/>
+              <w:jc w:val="center"/>
+            </w:pPr>
+            <w:r>
+              <w:rPr>
+                <w:rFonts w:ascii="Arial" w:hAnsi="Arial"/>
+                <w:b w:val="0"/>
+                <w:i w:val="0"/>
+                <w:color w:val="000000"/>
+                <w:sz w:val="17"/>
+              </w:rPr>
+              <w:t>Número do grupo</w:t>
+            </w:r>
+          </w:p>
+        </w:tc>
+        <w:tc>
+          <w:tcPr>
+            <w:tcW w:type="dxa" w:w="1587"/>
+            <w:vAlign w:val="center"/>
+            <w:tcMar>
+              <w:top w:w="90" w:type="dxa"/>
+              <w:start w:w="110" w:type="dxa"/>
+              <w:bottom w:w="90" w:type="dxa"/>
+              <w:end w:w="110" w:type="dxa"/>
+            </w:tcMar>
+          </w:tcPr>
+          <w:p>
+            <w:pPr>
+              <w:spacing w:after="0" w:line="252" w:lineRule="auto"/>
+            </w:pPr>
+            <w:r>
+              <w:rPr>
+                <w:rFonts w:ascii="Arial" w:hAnsi="Arial"/>
+                <w:b w:val="0"/>
+                <w:i w:val="0"/>
+                <w:color w:val="000000"/>
+                <w:sz w:val="17"/>
+              </w:rPr>
               <w:t>Pendente</w:t>
             </w:r>
           </w:p>
@@ -9593,7 +10590,6 @@
               <w:bottom w:w="90" w:type="dxa"/>
               <w:end w:w="110" w:type="dxa"/>
             </w:tcMar>
-            <w:shd w:fill="F5F7FA"/>
           </w:tcPr>
           <w:p>
             <w:pPr>
@@ -9641,7 +10637,7 @@
           <w:color w:val="000000"/>
           <w:sz w:val="22"/>
         </w:rPr>
-        <w:t>A Sprint 03 deve validar o ambiente em uma máquina da equipe, confirmar a criação do PostgreSQL, definir os primeiros contratos da API e integrar a página inicial ao endpoint de saúde. A equipe também deve transformar os casos de uso prioritários em tarefas semanais com critérios de aceite.</w:t>
+        <w:t>A Sprint 03 deve validar o ambiente em uma máquina da equipe, confirmar a criação do PostgreSQL e integrar o frontend aos endpoints de saúde e comparação do otimizador. A equipe também deve transformar os casos de uso prioritários em tarefas semanais com critérios de aceite e registrar contribuições individuais no GitHub.</w:t>
       </w:r>
     </w:p>
     <w:sectPr>

</xml_diff>